<commit_message>
R14: italicize pinyin, fix cross-reference and heading, capitalize Form and Age Group as factors
Co-Authored-By: Claude Opus 5.5 <noreply@anthropic.com>
Claude-Session: https://claude.ai/code/session_01Q96WePso3R7jviE8KBARip
</commit_message>
<xml_diff>
--- a/drafts/Manuscript_R14_APA.docx
+++ b/drafts/Manuscript_R14_APA.docx
@@ -630,6 +630,9 @@
       </w:r>
       <w:proofErr w:type="spellStart"/>
       <w:r>
+        <w:rPr>
+          <w:i/>
+        </w:rPr>
         <w:t>kū-shī</w:t>
       </w:r>
       <w:proofErr w:type="spellEnd"/>
@@ -638,6 +641,9 @@
       </w:r>
       <w:proofErr w:type="spellStart"/>
       <w:r>
+        <w:rPr>
+          <w:i/>
+        </w:rPr>
         <w:t>shǒupà</w:t>
       </w:r>
       <w:proofErr w:type="spellEnd"/>
@@ -663,6 +669,9 @@
       </w:r>
       <w:proofErr w:type="spellStart"/>
       <w:r>
+        <w:rPr>
+          <w:i/>
+        </w:rPr>
         <w:t>tī</w:t>
       </w:r>
       <w:proofErr w:type="spellEnd"/>
@@ -671,6 +680,9 @@
       </w:r>
       <w:proofErr w:type="spellStart"/>
       <w:r>
+        <w:rPr>
+          <w:i/>
+        </w:rPr>
         <w:t>tī-dǎo</w:t>
       </w:r>
       <w:proofErr w:type="spellEnd"/>
@@ -679,6 +691,9 @@
       </w:r>
       <w:proofErr w:type="spellStart"/>
       <w:r>
+        <w:rPr>
+          <w:i/>
+        </w:rPr>
         <w:t>tī-kāi</w:t>
       </w:r>
       <w:proofErr w:type="spellEnd"/>
@@ -687,6 +702,9 @@
       </w:r>
       <w:proofErr w:type="spellStart"/>
       <w:r>
+        <w:rPr>
+          <w:i/>
+        </w:rPr>
         <w:t>miè</w:t>
       </w:r>
       <w:proofErr w:type="spellEnd"/>
@@ -695,6 +713,9 @@
       </w:r>
       <w:proofErr w:type="spellStart"/>
       <w:r>
+        <w:rPr>
+          <w:i/>
+        </w:rPr>
         <w:t>chuī</w:t>
       </w:r>
       <w:proofErr w:type="spellEnd"/>
@@ -703,6 +724,9 @@
       </w:r>
       <w:proofErr w:type="spellStart"/>
       <w:r>
+        <w:rPr>
+          <w:i/>
+        </w:rPr>
         <w:t>pū</w:t>
       </w:r>
       <w:proofErr w:type="spellEnd"/>
@@ -929,6 +953,9 @@
       </w:r>
       <w:proofErr w:type="spellStart"/>
       <w:r>
+        <w:rPr>
+          <w:i/>
+        </w:rPr>
         <w:t>hǎojǐcì</w:t>
       </w:r>
       <w:proofErr w:type="spellEnd"/>
@@ -937,6 +964,9 @@
       </w:r>
       <w:proofErr w:type="spellStart"/>
       <w:r>
+        <w:rPr>
+          <w:i/>
+        </w:rPr>
         <w:t>guān</w:t>
       </w:r>
       <w:proofErr w:type="spellEnd"/>
@@ -945,6 +975,9 @@
       </w:r>
       <w:proofErr w:type="spellStart"/>
       <w:r>
+        <w:rPr>
+          <w:i/>
+        </w:rPr>
         <w:t>zhāi</w:t>
       </w:r>
       <w:proofErr w:type="spellEnd"/>
@@ -962,6 +995,9 @@
       </w:r>
       <w:proofErr w:type="spellStart"/>
       <w:r>
+        <w:rPr>
+          <w:i/>
+        </w:rPr>
         <w:t>hǎojǐcì</w:t>
       </w:r>
       <w:proofErr w:type="spellEnd"/>
@@ -997,6 +1033,9 @@
       </w:r>
       <w:proofErr w:type="spellStart"/>
       <w:r>
+        <w:rPr>
+          <w:i/>
+        </w:rPr>
         <w:t>méi</w:t>
       </w:r>
       <w:proofErr w:type="spellEnd"/>
@@ -1005,6 +1044,9 @@
       </w:r>
       <w:proofErr w:type="spellStart"/>
       <w:r>
+        <w:rPr>
+          <w:i/>
+        </w:rPr>
         <w:t>bāo-kāi</w:t>
       </w:r>
       <w:proofErr w:type="spellEnd"/>
@@ -1061,8 +1103,7 @@
         <w:t xml:space="preserve"> “extinguished”). After the child data had been collected, adult ratings of result likelihood and action typicality were obtained to verify and characterize this contrast. In eight pairs, the expected stronger-association expression received reliably higher ratings on both dimensions; these pairs, comprising eight stronger-association and eight weaker-</w:t>
       </w:r>
       <w:r>
-        <w:lastRenderedPageBreak/>
-        <w:t>association V1s, form the materials for the analyses of Experiment 1. The two remaining pairs, in which the typicality difference was reversed or neither difference was reliable, are excluded from these analyses (see Method).</w:t>
+        <w:t>association V1s, form the materials for the analyses of Experiment 1. The two remaining pairs, in which the typicality difference was reversed or neither difference was reliable, are excluded from these analyses (see Pair Selection).</w:t>
       </w:r>
     </w:p>
     <w:p>
@@ -5006,18 +5047,17 @@
         </w:rPr>
       </w:pPr>
       <w:r>
-        <w:t>RVC and V1</w:t>
+        <w:t>RVC and V1 Descriptions</w:t>
       </w:r>
       <w:r>
         <w:rPr>
           <w:rFonts w:eastAsiaTheme="minorEastAsia" w:hint="eastAsia"/>
         </w:rPr>
-        <w:t>s</w:t>
-      </w:r>
-    </w:p>
-    <w:p>
-      <w:r>
-        <w:t>The first model addresses RQ1. It includes form (RVC vs. V1), Result Realization (Full vs. Zero), age group (4-year-olds, 5-year-olds, adults), and their interactions; V1 trials with stronger- and weaker-association V1s are pooled. Random effects are intercepts for participants, items (a V1–object expression and its RVC), and pairs; a by-participant slope for Result Realization; and by-item slopes for form, Result Realization, and age group. The focal contrasts are the full–zero difference in acceptance for each form in each age group and the difference between these two differences (Form × Result Realization), which indicates whether Result Realization affects acceptance of the two forms differently. Comparing this interaction between children and adults and between 4- and 5-year-olds addresses the age questions in RQ1.</w:t>
+      </w:r>
+    </w:p>
+    <w:p>
+      <w:r>
+        <w:t>The first model addresses RQ1. It includes Form (RVC vs. V1), Result Realization (Full vs. Zero), Age Group (4-year-olds, 5-year-olds, adults), and their interactions; V1 trials with stronger- and weaker-association V1s are pooled. Random effects are intercepts for participants, items (a V1–object expression and its RVC), and pairs; a by-participant slope for Result Realization; and by-item slopes for Form, Result Realization, and Age Group. The focal contrasts are the full–zero difference in acceptance for each form in each age group and the difference between these two differences (Form × Result Realization), which indicates whether Result Realization affects acceptance of the two forms differently. Comparing this interaction between children and adults and between 4- and 5-year-olds addresses the age questions in RQ1.</w:t>
       </w:r>
     </w:p>
     <w:p>
@@ -5030,7 +5070,7 @@
     </w:p>
     <w:p>
       <w:r>
-        <w:t>The second model addresses RQ2 and uses V1 trials only. It includes Action–Result Association (Stronger vs. Weaker), Result Realization, age group, and their interactions. Random effects are intercepts for participants, items, and pairs; a by-participant slope for Result Realization; by-item slopes for Result Realization and age group; and a by-pair slope for Action–Result Association, which allows the difference between the two V1s of a pair to vary across pairs. The focal estimates are (a) the difference in acceptance between stronger- and weaker-association V1s in zero-result events in each age group (hereafter, the association effect); (b) the Action–Result Association × Result Realization interaction, which assesses whether the association effect is larger</w:t>
+        <w:t>The second model addresses RQ2 and uses V1 trials only. It includes Action–Result Association (Stronger vs. Weaker), Result Realization, Age Group, and their interactions. Random effects are intercepts for participants, items, and pairs; a by-participant slope for Result Realization; by-item slopes for Result Realization and Age Group; and a by-pair slope for Action–Result Association, which allows the difference between the two V1s of a pair to vary across pairs. The focal estimates are (a) the difference in acceptance between stronger- and weaker-association V1s in zero-result events in each age group (hereafter, the association effect); (b) the Action–Result Association × Result Realization interaction, which assesses whether the association effect is larger</w:t>
       </w:r>
       <w:r>
         <w:t xml:space="preserve"> in zero-result than in full-result events; and (c) the difference between children and adults in the association effect. Because adult acceptance in zero-result events may approach ceiling, the child–adult comparison is evaluated on the log-odds scale, and predicted probabilities are reported alongside.</w:t>
@@ -5046,7 +5086,7 @@
     </w:p>
     <w:p>
       <w:r>
-        <w:t>Three analyses assess whether the conclusions depend on the materials: (a) refitting both models with all 10 pairs, with the actions of Pairs 7 and 8 classified as stronger- or weaker-association as in the original design; (b) adding the item-level verb–video correspondence values as a covariate; and (c) refitting the models with each pair left out in turn. Because Pairs 7 and 8 were excluded after an initial analysis of the child data (see Pair Selection), analysis (a) is reported alongside the main results, and any conclusion that differs between the eight-pair and 10-pair analyses is stated. Frequentist refits are reported where they converge. These analyses are not used to select a preferred subset of items. Acceptance of each V1 and RVC description is also reported by Result Realization and age group, to show whether the association effect is carried by most pairs or by a few.</w:t>
+        <w:t>Three analyses assess whether the conclusions depend on the materials: (a) refitting both models with all 10 pairs, with the actions of Pairs 7 and 8 classified as stronger- or weaker-association as in the original design; (b) adding the item-level verb–video correspondence values as a covariate; and (c) refitting the models with each pair left out in turn. Because Pairs 7 and 8 were excluded after an initial analysis of the child data (see Pair Selection), analysis (a) is reported alongside the main results, and any conclusion that differs between the eight-pair and 10-pair analyses is stated. Frequentist refits are reported where they converge. These analyses are not used to select a preferred subset of items. Acceptance of each V1 and RVC description is also reported by Result Realization and Age Group, to show whether the association effect is carried by most pairs or by a few.</w:t>
       </w:r>
     </w:p>
     <w:p>
@@ -5391,10 +5431,10 @@
     </w:p>
     <w:p>
       <w:r>
-        <w:t>Two binary outcomes are modeled with the Bayesian specification of Experiment 1: whether a response contains an RVC and whether it mentions the target result. Each model includes Result Realization, age group, and their interaction, with random intercepts for participants, items (the videos of one action), and pairs; a by-participant slope for Result Realization; and by-item slopes for Result Realization and age group</w:t>
-      </w:r>
-      <w:r>
-        <w:t xml:space="preserve">. Because negated RVCs are counted as RVCs, the first outcome concerns the form of the description regardless of whether the result is affirmed or denied. Because every RVC mentions both the action and the target result, the two outcomes overlap by design; comparing them shows whether fewer RVCs in zero-result events reflect fewer mentions of the result or a shift to other ways of mentioning it. Among responses without an RVC, the proportions of action-only, result-only, and separate-predicate responses are reported by Result Realization and age group and modeled if cell sizes permit. </w:t>
+        <w:t>Two binary outcomes are modeled with the Bayesian specification of Experiment 1: whether a response contains an RVC and whether it mentions the target result. Each model includes Result Realization, Age Group, and their interaction, with random intercepts for participants, items (the videos of one action), and pairs; a by-participant slope for Result Realization; and by-item slopes for Result Realization and Age Group.</w:t>
+      </w:r>
+      <w:r>
+        <w:t xml:space="preserve"> Because negated RVCs are counted as RVCs, the first outcome concerns the form of the description regardless of whether the result is affirmed or denied. Because every RVC mentions both the action and the target result, the two outcomes overlap by design; comparing them shows whether fewer RVCs in zero-result events reflect fewer mentions of the result or a shift to other ways of mentioning it. Among responses without an RVC, the proportions of action-only, result-only, and separate-predicate responses are reported by Result Realization and Age Group and modeled if cell sizes permit. </w:t>
       </w:r>
       <w:r>
         <w:rPr>
@@ -5845,11 +5885,6 @@
       <w:r>
         <w:t>(2), 191–222. https://doi.org/10.1017/cnj.2021.11</w:t>
       </w:r>
-      <w:r>
-        <w:rPr>
-          <w:highlight w:val="yellow"/>
-        </w:rPr>
-      </w:r>
       <w:proofErr w:type="spellStart"/>
       <w:proofErr w:type="spellEnd"/>
     </w:p>
@@ -6094,11 +6129,6 @@
       <w:r>
         <w:t xml:space="preserve"> [Doctoral dissertation, Université de Nantes].</w:t>
       </w:r>
-      <w:r>
-        <w:rPr>
-          <w:highlight w:val="yellow"/>
-        </w:rPr>
-      </w:r>
       <w:proofErr w:type="spellStart"/>
       <w:proofErr w:type="spellEnd"/>
     </w:p>
@@ -6211,11 +6241,6 @@
       <w:r>
         <w:t>. Universität Tübingen.</w:t>
       </w:r>
-      <w:r>
-        <w:rPr>
-          <w:highlight w:val="yellow"/>
-        </w:rPr>
-      </w:r>
       <w:proofErr w:type="spellStart"/>
       <w:proofErr w:type="spellEnd"/>
     </w:p>
@@ -6235,11 +6260,6 @@
       <w:r>
         <w:t xml:space="preserve"> [Preprint]. ResearchGate.</w:t>
       </w:r>
-      <w:r>
-        <w:rPr>
-          <w:highlight w:val="yellow"/>
-        </w:rPr>
-      </w:r>
     </w:p>
     <w:p>
       <w:pPr>
@@ -6315,11 +6335,6 @@
       <w:r>
         <w:t>, 6–18. https://doi.org/10.1016/j.cognition.2016.04.006</w:t>
       </w:r>
-      <w:r>
-        <w:rPr>
-          <w:highlight w:val="yellow"/>
-        </w:rPr>
-      </w:r>
       <w:proofErr w:type="spellStart"/>
       <w:proofErr w:type="spellEnd"/>
     </w:p>
@@ -6339,11 +6354,6 @@
       <w:r>
         <w:t xml:space="preserve"> (Version 3.0) [Computer software]. Zenodo. https://doi.org/10.5281/zenodo.7199437</w:t>
       </w:r>
-      <w:r>
-        <w:rPr>
-          <w:highlight w:val="yellow"/>
-        </w:rPr>
-      </w:r>
     </w:p>
     <w:p>
       <w:pPr>
@@ -6395,11 +6405,6 @@
       </w:r>
       <w:r>
         <w:t xml:space="preserve"> (pp. 289–296). Chicago Linguistic Society.</w:t>
-      </w:r>
-      <w:r>
-        <w:rPr>
-          <w:highlight w:val="yellow"/>
-        </w:rPr>
       </w:r>
       <w:proofErr w:type="spellStart"/>
       <w:proofErr w:type="spellEnd"/>
@@ -6482,11 +6487,6 @@
       </w:r>
       <w:r>
         <w:t>(1), 71–86.</w:t>
-      </w:r>
-      <w:r>
-        <w:rPr>
-          <w:highlight w:val="yellow"/>
-        </w:rPr>
       </w:r>
     </w:p>
     <w:sectPr>

</xml_diff>

<commit_message>
R14: restate child-adult prediction as simple effects within stronger and weaker V1s; equivalence test; probability scale with log-odds reported
Co-Authored-By: Claude Opus 5.5 <noreply@anthropic.com>
Claude-Session: https://claude.ai/code/session_01Q96WePso3R7jviE8KBARip
</commit_message>
<xml_diff>
--- a/drafts/Manuscript_R14_APA.docx
+++ b/drafts/Manuscript_R14_APA.docx
@@ -1144,7 +1144,7 @@
         <w:t xml:space="preserve"> </w:t>
       </w:r>
       <w:r>
-        <w:t>Within pairs matched for object and target result, do children interpret stronger- and weaker-association V1s differently, as indexed by whether acceptance of V1 descriptions differs between them, particularly in zero-result events, and is this difference larger in children than in adults?</w:t>
+        <w:t>Within pairs matched for object and target result, do children interpret stronger- and weaker-association V1s differently, as indexed by whether acceptance of V1 descriptions differs between them, particularly in zero-result events, and do children differ from adults more for stronger- than for weaker-association V1s?</w:t>
       </w:r>
     </w:p>
     <w:p>
@@ -1152,7 +1152,7 @@
         <w:t xml:space="preserve">RVC descriptions are expected to be accepted for full-result and rejected for zero-result events, although children may accept some RVC descriptions of zero-result events (J. Liu et al., 2026). </w:t>
       </w:r>
       <w:r>
-        <w:t>V1 descriptions are expected to be accepted less often in zero-result than in full-result events, but this difference should be smaller than for RVCs. Because children judge V1 descriptions of zero-result events more strictly than adults (Chen, 2017; J. Liu et al., 2026), the difference between the two forms is expected to be smaller in children than in adults. In zero-result events, stronger-association V1s are expected to be accepted less often than their weaker-association partners, with a smaller difference in full-result events. This difference is expected to be larger in children than in adults: Adults accept V1 descriptions of zero-result events at high rates (Chen, 2017), whereas children’s stricter judgments leave room for the association to matter.</w:t>
+        <w:t>V1 descriptions are expected to be accepted less often in zero-result than in full-result events, but this difference should be smaller than for RVCs. Because children judge V1 descriptions of zero-result events more strictly than adults (Chen, 2017; J. Liu et al., 2026), the difference between the two forms is expected to be smaller in children than in adults. In zero-result events, stronger-association V1s are expected to be accepted less often than their weaker-association partners, with a smaller difference in full-result events. In zero-result events, children are expected to accept descriptions with stronger-association V1s less often than adults, whereas the child–adult difference for weaker-association V1s is expected to be smaller or absent; that is, children’s stricter judgments of V1 descriptions (Chen, 2017; J. Liu et al., 2026) are expected to arise mainly when the action is strongly associated with the result.</w:t>
       </w:r>
     </w:p>
     <w:p>
@@ -5073,7 +5073,16 @@
         <w:t>The second model addresses RQ2 and uses V1 trials only. It includes Action–Result Association (Stronger vs. Weaker), Result Realization, Age Group, and their interactions. Random effects are intercepts for participants, items, and pairs; a by-participant slope for Result Realization; by-item slopes for Result Realization and Age Group; and a by-pair slope for Action–Result Association, which allows the difference between the two V1s of a pair to vary across pairs. The focal estimates are (a) the difference in acceptance between stronger- and weaker-association V1s in zero-result events in each age group (hereafter, the association effect); (b) the Action–Result Association × Result Realization interaction, which assesses whether the association effect is larger</w:t>
       </w:r>
       <w:r>
-        <w:t xml:space="preserve"> in zero-result than in full-result events; and (c) the difference between children and adults in the association effect. Because adult acceptance in zero-result events may approach ceiling, the child–adult comparison is evaluated on the log-odds scale, and predicted probabilities are reported alongside.</w:t>
+        <w:t xml:space="preserve"> in zero-result than in full-result events; and (c) the difference in acceptance between children and adults in zero-result events, estimated separately for stronger- and weaker-association V1s. Because the prediction concerns how often children accept these descriptions, the child–adult differences are evaluated as differences in predicted acceptance probability. For weaker-association V1s, children and adults are considered equivalent if the 95% credible interval of the difference lies entirely within ±10 percentage points (Kruschke, 2018). Because adult acceptance may approach ceiling, the corresponding log-odds estimates and the Action–Result Association × Age Group interaction are also reported.</w:t>
+      </w:r>
+      <w:r>
+        <w:t xml:space="preserve"> </w:t>
+      </w:r>
+      <w:r>
+        <w:rPr>
+          <w:highlight w:val="yellow"/>
+        </w:rPr>
+        <w:t>[等价区间宽度待定]</w:t>
       </w:r>
     </w:p>
     <w:p>
@@ -5584,7 +5593,7 @@
     </w:p>
     <w:p>
       <w:r>
-        <w:t>A larger association effect in children than in adults would locate children’s stricter judgments mainly in V1s that name strongly associated actions. This pattern is compatible with three explanations that the binary task cannot separate: Children may find it harder than adults to set aside an inference that the result occurred, may reject a true description as inadequate because it leaves an expected result unaddressed, or may judge a failed attempt to be a poor instance of the action. The pragmatic explanation fits less naturally with a larger difference in children, because children tend to be more tolerant than adults of underinformative descriptions in binary judgment tasks (Katsos &amp; Bishop, 2011). Because adult acceptance in zero-result events may approach ceiling, however, a larger child difference on the probability scale could partly reflect the adult ceiling, which is why the comparison is evaluated on the log-odds scale.</w:t>
+        <w:t>If children accept descriptions with stronger-association V1s less often than adults but do not differ from adults for weaker-association V1s, their stricter judgments would be located mainly in V1s that name strongly associated actions. This pattern is compatible with three explanations that the binary task cannot separate: Children may find it harder than adults to set aside an inference that the result occurred, may reject a true description as inadequate because it leaves an expected result unaddressed, or may judge a failed attempt to be a poor instance of the action. The pragmatic explanation fits less naturally with this pattern, because children tend to be more tolerant than adults of underinformative descriptions in binary judgment tasks (Katsos &amp; Bishop, 2011). Because adult acceptance in zero-result events may approach ceiling, however, a pattern found in acceptance probabilities need not hold on the log-odds scale, and conclusions about whether children are more sensitive than adults to action–result association take both scales into account.</w:t>
       </w:r>
     </w:p>
     <w:p>
@@ -6029,6 +6038,23 @@
       </w:r>
       <w:r>
         <w:t>(4), 1053–1078. https://doi.org/10.1017/langcog.2023.72</w:t>
+      </w:r>
+    </w:p>
+    <w:p>
+      <w:pPr>
+        <w:pStyle w:val="Reference"/>
+      </w:pPr>
+      <w:r>
+        <w:t xml:space="preserve">Kruschke, J. K. (2018). Rejecting or accepting parameter values in Bayesian estimation. </w:t>
+      </w:r>
+      <w:r>
+        <w:rPr>
+          <w:i/>
+        </w:rPr>
+        <w:t>Advances in Methods and Practices in Psychological Science, 1</w:t>
+      </w:r>
+      <w:r>
+        <w:t>(2), 270–280. https://doi.org/10.1177/2515245918771304</w:t>
       </w:r>
     </w:p>
     <w:p>

</xml_diff>

<commit_message>
R14: association effect predicted in all groups, children lower overall; child-adult interaction non-directional; disclose initial analysis
Co-Authored-By: Claude Opus 5.5 <noreply@anthropic.com>
Claude-Session: https://claude.ai/code/session_01Q96WePso3R7jviE8KBARip
</commit_message>
<xml_diff>
--- a/drafts/Manuscript_R14_APA.docx
+++ b/drafts/Manuscript_R14_APA.docx
@@ -1144,7 +1144,7 @@
         <w:t xml:space="preserve"> </w:t>
       </w:r>
       <w:r>
-        <w:t>Within pairs matched for object and target result, do children interpret stronger- and weaker-association V1s differently, as indexed by whether acceptance of V1 descriptions differs between them, particularly in zero-result events, and do children differ from adults more for stronger- than for weaker-association V1s?</w:t>
+        <w:t>Within pairs matched for object and target result, do children interpret stronger- and weaker-association V1s differently, as indexed by whether acceptance of V1 descriptions differs between them, particularly in zero-result events, and does this difference differ between children and adults?</w:t>
       </w:r>
     </w:p>
     <w:p>
@@ -1152,7 +1152,7 @@
         <w:t xml:space="preserve">RVC descriptions are expected to be accepted for full-result and rejected for zero-result events, although children may accept some RVC descriptions of zero-result events (J. Liu et al., 2026). </w:t>
       </w:r>
       <w:r>
-        <w:t>V1 descriptions are expected to be accepted less often in zero-result than in full-result events, but this difference should be smaller than for RVCs. Because children judge V1 descriptions of zero-result events more strictly than adults (Chen, 2017; J. Liu et al., 2026), the difference between the two forms is expected to be smaller in children than in adults. In zero-result events, stronger-association V1s are expected to be accepted less often than their weaker-association partners, with a smaller difference in full-result events. In zero-result events, children are expected to accept descriptions with stronger-association V1s less often than adults, whereas the child–adult difference for weaker-association V1s is expected to be smaller or absent; that is, children’s stricter judgments of V1 descriptions (Chen, 2017; J. Liu et al., 2026) are expected to arise mainly when the action is strongly associated with the result.</w:t>
+        <w:t>V1 descriptions are expected to be accepted less often in zero-result than in full-result events, but this difference should be smaller than for RVCs. Because children judge V1 descriptions of zero-result events more strictly than adults (Chen, 2017; J. Liu et al., 2026), the difference between the two forms is expected to be smaller in children than in adults. In zero-result events, stronger-association V1s are expected to be accepted less often than their weaker-association partners in all age groups, with a smaller difference in full-result events, and children are expected to accept V1 descriptions of zero-result events less often than adults regardless of association (Chen, 2017; J. Liu et al., 2026). No directional prediction is made about whether the association effect differs between children and adults. An initial analysis of the child data with all 10 pairs and the original Strong/Weak coding showed effects of both association and age group on V1 acceptance in zero-result events but no interaction between them (see Pair Selection).</w:t>
       </w:r>
     </w:p>
     <w:p>
@@ -5073,16 +5073,7 @@
         <w:t>The second model addresses RQ2 and uses V1 trials only. It includes Action–Result Association (Stronger vs. Weaker), Result Realization, Age Group, and their interactions. Random effects are intercepts for participants, items, and pairs; a by-participant slope for Result Realization; by-item slopes for Result Realization and Age Group; and a by-pair slope for Action–Result Association, which allows the difference between the two V1s of a pair to vary across pairs. The focal estimates are (a) the difference in acceptance between stronger- and weaker-association V1s in zero-result events in each age group (hereafter, the association effect); (b) the Action–Result Association × Result Realization interaction, which assesses whether the association effect is larger</w:t>
       </w:r>
       <w:r>
-        <w:t xml:space="preserve"> in zero-result than in full-result events; and (c) the difference in acceptance between children and adults in zero-result events, estimated separately for stronger- and weaker-association V1s. Because the prediction concerns how often children accept these descriptions, the child–adult differences are evaluated as differences in predicted acceptance probability. For weaker-association V1s, children and adults are considered equivalent if the 95% credible interval of the difference lies entirely within ±10 percentage points (Kruschke, 2018). Because adult acceptance may approach ceiling, the corresponding log-odds estimates and the Action–Result Association × Age Group interaction are also reported.</w:t>
-      </w:r>
-      <w:r>
-        <w:t xml:space="preserve"> </w:t>
-      </w:r>
-      <w:r>
-        <w:rPr>
-          <w:highlight w:val="yellow"/>
-        </w:rPr>
-        <w:t>[等价区间宽度待定]</w:t>
+        <w:t xml:space="preserve"> in zero-result than in full-result events; and (c) the Action–Result Association × Age Group interaction in zero-result events, which assesses whether the association effect differs between children and adults. Because adult acceptance in zero-result events may approach ceiling, this interaction is reported both on the log-odds scale and as differences in predicted acceptance probability.</w:t>
       </w:r>
     </w:p>
     <w:p>
@@ -5593,7 +5584,7 @@
     </w:p>
     <w:p>
       <w:r>
-        <w:t>If children accept descriptions with stronger-association V1s less often than adults but do not differ from adults for weaker-association V1s, their stricter judgments would be located mainly in V1s that name strongly associated actions. This pattern is compatible with three explanations that the binary task cannot separate: Children may find it harder than adults to set aside an inference that the result occurred, may reject a true description as inadequate because it leaves an expected result unaddressed, or may judge a failed attempt to be a poor instance of the action. The pragmatic explanation fits less naturally with this pattern, because children tend to be more tolerant than adults of underinformative descriptions in binary judgment tasks (Katsos &amp; Bishop, 2011). Because adult acceptance in zero-result events may approach ceiling, however, a pattern found in acceptance probabilities need not hold on the log-odds scale, and conclusions about whether children are more sensitive than adults to action–result association take both scales into account.</w:t>
+        <w:t>If children and adults show similar association effects, children are sensitive to action–result association in the same way as adults, and their stricter judgments of V1 descriptions hold regardless of how strongly the action is associated with the result. Their lower acceptance would then reflect a general difference in how children evaluate V1 descriptions of failed attempts. Three explanations of this difference cannot be separated by the binary task: Children may find it harder than adults to set aside an inference that the result occurred, may reject a true description as inadequate because it leaves an expected result unaddressed, or may judge a failed attempt to be a poor instance of the action. If, instead, the association effect is larger in children, their stricter judgments would be located mainly in V1s that name strongly associated actions; the pragmatic explanation would fit this pattern less naturally, because children tend to be more tolerant than adults of underinformative descriptions in binary judgment tasks (Katsos &amp; Bishop, 2011). Because adult acceptance in zero-result events may approach ceiling, however, a pattern found in acceptance probabilities need not hold on the log-odds scale, and conclusions take both scales into account.</w:t>
       </w:r>
     </w:p>
     <w:p>
@@ -6038,23 +6029,6 @@
       </w:r>
       <w:r>
         <w:t>(4), 1053–1078. https://doi.org/10.1017/langcog.2023.72</w:t>
-      </w:r>
-    </w:p>
-    <w:p>
-      <w:pPr>
-        <w:pStyle w:val="Reference"/>
-      </w:pPr>
-      <w:r>
-        <w:t xml:space="preserve">Kruschke, J. K. (2018). Rejecting or accepting parameter values in Bayesian estimation. </w:t>
-      </w:r>
-      <w:r>
-        <w:rPr>
-          <w:i/>
-        </w:rPr>
-        <w:t>Advances in Methods and Practices in Psychological Science, 1</w:t>
-      </w:r>
-      <w:r>
-        <w:t>(2), 270–280. https://doi.org/10.1177/2515245918771304</w:t>
       </w:r>
     </w:p>
     <w:p>

</xml_diff>